<commit_message>
docs(audit): Auditoría Multidisciplinaria Final AUDITORIA_FINAL.md y Guía completa para el Profesor en README.md
</commit_message>
<xml_diff>
--- a/MEMORIA_ACADEMICA_PROYECTO_INTEGRADOR_DUAL.docx
+++ b/MEMORIA_ACADEMICA_PROYECTO_INTEGRADOR_DUAL.docx
@@ -442,7 +442,7 @@
     </w:p>
     <w:p>
       <w:r>
-        <w:t>El presente trabajo describe el desarrollo e implementación de ProGest Smart Analytics, una plataforma web para la gestión de proyectos que incorpora un motor predictivo denominado Smart Risk Engine. Este motor evalúa continuamente cuatro variables operativas clave en el módulo fuente app/services/risk_engine_service.py: la proximidad a la fecha límite ($F_{deadline}$), el porcentaje de avance de las listas de verificación ($F_{checklist}$), la sobrecarga de trabajo del desarrollador asignado ($F_{overload}$) y el tiempo de estancamiento en el flujo de trabajo ($F_{stagnation}$).</w:t>
+        <w:t>El presente trabajo describe el desarrollo e implementación de ProGest Smart Analytics, una plataforma web para la gestión de proyectos que incorpora un motor predictivo denominado Smart Risk Engine. Este motor evalúa continuamente cuatro variables operativas clave en el módulo fuente app/services/risk_engine_service.py: la proximidad a la fecha límite (F_deadline), el porcentaje de avance de las listas de verificación (F_checklist), la sobrecarga de trabajo del desarrollador asignado (F_overload) y el tiempo de estancamiento en el flujo de trabajo (F_stagnation).</w:t>
       </w:r>
     </w:p>
     <w:p>
@@ -452,7 +452,7 @@
     </w:p>
     <w:p>
       <w:r>
-        <w:t>Mediante auditorías funcionales, pruebas de humo E2E y un análisis estadístico cuantitativo sobre una muestra real de n = 67 tareas en base de datos distribuidas en 11 proyectos activos, se evaluó la efectividad del sistema, obteniendo una probabilidad promedio de retraso global de mu = 0.2410 (sigma = 0.3474) y logrando la detección anticipada de las tareas clasificadas en riesgo alto antes de su vencimiento, aportando evidencia empírica para la validación de la hipótesis de investigación.</w:t>
+        <w:t>Mediante auditorías funcionales, pruebas de humo E2E y un análisis estadístico cuantitativo sobre una muestra real de n = 67 tareas en base de datos distribuidas en 11 proyectos activos, se evaluó la efectividad del sistema, obteniendo una probabilidad promedio de retraso global de μ = 0.2410 (σ = 0.3474) y logrando la detección anticipada de las tareas clasificadas en riesgo alto antes de su vencimiento, aportando evidencia empírica para la validación de la hipótesis de investigación.</w:t>
       </w:r>
     </w:p>
     <w:p>
@@ -644,7 +644,7 @@
     </w:p>
     <w:p>
       <w:r>
-        <w:t>2. Formular e implementar el Smart Risk Engine, un algoritmo de evaluación heurística que calcule la probabilidad de retraso $P(delay_i)$ y genere explicaciones causales en la UI.</w:t>
+        <w:t>2. Formular e implementar el Smart Risk Engine, un algoritmo de evaluación heurística que calcule la probabilidad de retraso P(delay_i) y genere explicaciones causales en la UI.</w:t>
       </w:r>
     </w:p>
     <w:p>
@@ -711,7 +711,7 @@
           <w:color w:val="334155"/>
           <w:sz w:val="24"/>
         </w:rPr>
-        <w:t>6.2 Variable Independiente ($X$)</w:t>
+        <w:t>6.2 Variable Independiente (X)</w:t>
       </w:r>
     </w:p>
     <w:p>
@@ -741,7 +741,7 @@
           <w:color w:val="334155"/>
           <w:sz w:val="24"/>
         </w:rPr>
-        <w:t>6.3 Variable Dependiente ($Y$)</w:t>
+        <w:t>6.3 Variable Dependiente (Y)</w:t>
       </w:r>
     </w:p>
     <w:p>
@@ -781,7 +781,7 @@
     </w:p>
     <w:p>
       <w:r>
-        <w:t>$$TTFP = \left( \frac{\text{Tareas Retrasadas}}{\text{Total de Tareas}} \right) \times 100$$</w:t>
+        <w:t>TTFP = (Tareas Retrasadas / Total de Tareas) * 100</w:t>
       </w:r>
     </w:p>
     <w:p>
@@ -2495,7 +2495,7 @@
     </w:p>
     <w:p>
       <w:r>
-        <w:t>1. Evaluación de Fecha Límite ($due\_date$):</w:t>
+        <w:t>1. Evaluación de Fecha Límite (due_date):</w:t>
       </w:r>
     </w:p>
     <w:p>
@@ -2503,7 +2503,7 @@
         <w:pStyle w:val="ListBullet"/>
       </w:pPr>
       <w:r>
-        <w:t>Tarea vencida: $delay\_probability = 1.0$, factor overdue.</w:t>
+        <w:t>Tarea vencida: delay_probability = 1.0, factor overdue.</w:t>
       </w:r>
     </w:p>
     <w:p>
@@ -2511,7 +2511,7 @@
         <w:pStyle w:val="ListBullet"/>
       </w:pPr>
       <w:r>
-        <w:t>Horas restantes &lt;= 24: +0.60 a $delay\_probability$ (due_date_proximity_critical).</w:t>
+        <w:t>Horas restantes &lt;= 24: +0.60 a delay_probability (due_date_proximity_critical).</w:t>
       </w:r>
     </w:p>
     <w:p>
@@ -2519,7 +2519,7 @@
         <w:pStyle w:val="ListBullet"/>
       </w:pPr>
       <w:r>
-        <w:t>Horas restantes &lt;= 72: +0.35 a $delay\_probability$ (due_date_proximity_warning).</w:t>
+        <w:t>Horas restantes &lt;= 72: +0.35 a delay_probability (due_date_proximity_warning).</w:t>
       </w:r>
     </w:p>
     <w:p>
@@ -2527,12 +2527,12 @@
         <w:pStyle w:val="ListBullet"/>
       </w:pPr>
       <w:r>
-        <w:t>Horas restantes &lt;= 168 (1 semana): +0.15 a $delay\_probability$ (due_date_proximity_notice).</w:t>
+        <w:t>Horas restantes &lt;= 168 (1 semana): +0.15 a delay_probability (due_date_proximity_notice).</w:t>
       </w:r>
     </w:p>
     <w:p>
       <w:r>
-        <w:t>2. Evaluación de Lista de Verificación ($checklist$):</w:t>
+        <w:t>2. Evaluación de Lista de Verificación (checklist):</w:t>
       </w:r>
     </w:p>
     <w:p>
@@ -2577,7 +2577,7 @@
     </w:p>
     <w:p>
       <w:r>
-        <w:t>3. Evaluación de Sobrecarga del Desarrollador ($assigned\_to$):</w:t>
+        <w:t>3. Evaluación de Sobrecarga del Desarrollador (assigned_to):</w:t>
       </w:r>
     </w:p>
     <w:p>
@@ -2590,7 +2590,7 @@
     </w:p>
     <w:p>
       <w:r>
-        <w:t>4. Evaluación de Estancamiento ($TaskStateHistory$):</w:t>
+        <w:t>4. Evaluación de Estancamiento (TaskStateHistory):</w:t>
       </w:r>
     </w:p>
     <w:p>
@@ -2611,7 +2611,7 @@
     </w:p>
     <w:p>
       <w:r>
-        <w:t>La probabilidad resultante se acota en el rango $0.0 \le P(delay_i) \le 1.0$.</w:t>
+        <w:t>La probabilidad resultante se acota estrictamente en el rango 0.0 &lt;= P(delay_i) &lt;= 1.0.</w:t>
       </w:r>
     </w:p>
     <w:p>
@@ -2746,7 +2746,7 @@
         <w:pStyle w:val="ListBullet"/>
       </w:pPr>
       <w:r>
-        <w:t>Fecha Límite: Faltan 12 horas ($hours\_left = 12 \le 24 \rightarrow +0.60$, factor due_date_proximity_critical).</w:t>
+        <w:t>Fecha Límite: Faltan 12 horas (hours_left = 12 &lt;= 24 -&gt; +0.60, factor due_date_proximity_critical).</w:t>
       </w:r>
     </w:p>
     <w:p>
@@ -2754,7 +2754,7 @@
         <w:pStyle w:val="ListBullet"/>
       </w:pPr>
       <w:r>
-        <w:t>Checklist: 0 de 4 subtareas completadas ($rate = 0.0 \rightarrow +0.10$ adicional, factor incomplete_checklist).</w:t>
+        <w:t>Checklist: 0 de 4 subtareas completadas (rate = 0.0 -&gt; +0.10 adicional, factor incomplete_checklist).</w:t>
       </w:r>
     </w:p>
     <w:p>
@@ -2762,7 +2762,7 @@
         <w:pStyle w:val="ListBullet"/>
       </w:pPr>
       <w:r>
-        <w:t>Sobrecarga: Desarrollador asignado con 3 tareas activas en el proyecto ($\rightarrow +0.15$, factor developer_overload).</w:t>
+        <w:t>Sobrecarga: Desarrollador asignado con 3 tareas activas en el proyecto (-&gt; +0.15, factor developer_overload).</w:t>
       </w:r>
     </w:p>
     <w:p>
@@ -2770,7 +2770,7 @@
         <w:pStyle w:val="ListBullet"/>
       </w:pPr>
       <w:r>
-        <w:t>Estancamiento: 6 días en estado in_progress en TaskStateHistory ($\rightarrow +0.20$, factor status_stagnation).</w:t>
+        <w:t>Estancamiento: 6 días en estado in_progress en TaskStateHistory (-&gt; +0.20, factor status_stagnation).</w:t>
       </w:r>
     </w:p>
     <w:p>
@@ -2780,7 +2780,7 @@
     </w:p>
     <w:p>
       <w:r>
-        <w:t>$$P(delay) = 0.60 + 0.10 + 0.15 + 0.20 = 1.05 \xrightarrow{\text{acotado}} 1.00$$</w:t>
+        <w:t>P(delay) = 0.60 + 0.10 + 0.15 + 0.20 = 1.05 -&gt; acotado a 1.00</w:t>
       </w:r>
     </w:p>
     <w:p>
@@ -5275,7 +5275,7 @@
         <w:pStyle w:val="ListBullet"/>
       </w:pPr>
       <w:r>
-        <w:t>Tasa de entregas extemporáneas sin alertas predictivas: $TTFP_{antes} = \left(\frac{5}{10}\right) \times 100 = 50.0\%$.</w:t>
+        <w:t>Tasa de entregas extemporáneas sin alertas predictivas: TTFP_antes = (5 / 10) * 100 = 50.0%.</w:t>
       </w:r>
     </w:p>
     <w:p>
@@ -5288,7 +5288,7 @@
         <w:pStyle w:val="ListBullet"/>
       </w:pPr>
       <w:r>
-        <w:t>El motor predictivo identificó preventivamente las 5 tareas en condición crítica con $P(delay) \ge 0.95$.</w:t>
+        <w:t>El motor predictivo identificó preventivamente las 5 tareas en condición crítica con P(delay) &gt;= 0.95.</w:t>
       </w:r>
     </w:p>
     <w:p>
@@ -5296,7 +5296,7 @@
         <w:pStyle w:val="ListBullet"/>
       </w:pPr>
       <w:r>
-        <w:t>Al exponer las alertas rojas y los factores de causa origen en la UI, los responsables intervinieron completando subtareas y reasignando desarrolladores, logrando que únicamente 1 tarea cerrara fuera de plazo ($TTFP_{después} = 10.0\%$).</w:t>
+        <w:t>Al exponer las alertas rojas y los factores de causa origen en la UI, los responsables intervinieron completando subtareas y reasignando desarrolladores, logrando que únicamente 1 tarea cerrara fuera de plazo (TTFP_después = 10.0%).</w:t>
       </w:r>
     </w:p>
     <w:p>
@@ -5306,7 +5306,7 @@
     </w:p>
     <w:p>
       <w:r>
-        <w:t>$$\text{Reducción Relativa} = \left( \frac{TTFP_{antes} - TTFP_{después}}{TTFP_{antes}} \right) \times 100 = \left( \frac{50.0\% - 10.0\%}{50.0\%} \right) \times 100 = 80.0\%$$</w:t>
+        <w:t>Reducción Relativa = ((TTFP_antes - TTFP_después) / TTFP_antes) * 100 = ((50.0% - 10.0%) / 50.0%) * 100 = 80.0%</w:t>
       </w:r>
     </w:p>
     <w:p>
@@ -5382,7 +5382,7 @@
     </w:p>
     <w:p>
       <w:r>
-        <w:t>1. Notificaciones Push en Tiempo Real (WebSockets): Implementar una capa de eventos mediante WebSockets para alertar a los miembros del equipo cuando una tarea supere el umbral $P(delay) \ge 0.75$.</w:t>
+        <w:t>1. Notificaciones Push en Tiempo Real (WebSockets): Implementar una capa de eventos mediante WebSockets para alertar a los miembros del equipo cuando una tarea supere el umbral P(delay) &gt;= 0.75.</w:t>
       </w:r>
     </w:p>
     <w:p>

</xml_diff>

<commit_message>
docs(vercel): Integrar URL oficial de despliegue Vercel en la memoria académica .md y .docx
</commit_message>
<xml_diff>
--- a/MEMORIA_ACADEMICA_PROYECTO_INTEGRADOR_DUAL.docx
+++ b/MEMORIA_ACADEMICA_PROYECTO_INTEGRADOR_DUAL.docx
@@ -125,7 +125,19 @@
         <w:rPr>
           <w:b/>
         </w:rPr>
-        <w:t>Repositorio Oficial:</w:t>
+        <w:t>Despliegue Oficial Vercel:</w:t>
+      </w:r>
+      <w:r>
+        <w:t xml:space="preserve"> https://progest-smart-analytics.vercel.app</w:t>
+      </w:r>
+    </w:p>
+    <w:p>
+      <w:r/>
+      <w:r>
+        <w:rPr>
+          <w:b/>
+        </w:rPr>
+        <w:t>Repositorio Oficial GitHub:</w:t>
       </w:r>
       <w:r>
         <w:t xml:space="preserve"> https://github.com/Daniel-Macias-hub/Progest-Smart-Analytics</w:t>
@@ -442,7 +454,7 @@
     </w:p>
     <w:p>
       <w:r>
-        <w:t>El presente trabajo describe el desarrollo e implementación de ProGest Smart Analytics, una plataforma web para la gestión de proyectos que incorpora un motor predictivo denominado Smart Risk Engine. Este motor evalúa continuamente cuatro variables operativas clave en el módulo fuente app/services/risk_engine_service.py: la proximidad a la fecha límite (F_deadline), el porcentaje de avance de las listas de verificación (F_checklist), la sobrecarga de trabajo del desarrollador asignado (F_overload) y el tiempo de estancamiento en el flujo de trabajo (F_stagnation).</w:t>
+        <w:t>El presente trabajo describe el desarrollo e implementación de ProGest Smart Analytics, una plataforma web desplegada en Vercel (https://progest-smart-analytics.vercel.app) para la gestión de proyectos que incorpora un motor predictivo denominado Smart Risk Engine. Este motor evalúa continuamente cuatro variables operativas clave en el módulo fuente app/services/risk_engine_service.py: la proximidad a la fecha límite (F_deadline), el porcentaje de avance de las listas de verificación (F_checklist), la sobrecarga de trabajo del desarrollador asignado (F_overload) y el tiempo de estancamiento en el flujo de trabajo (F_stagnation).</w:t>
       </w:r>
     </w:p>
     <w:p>
@@ -568,7 +580,7 @@
     </w:p>
     <w:p>
       <w:r>
-        <w:t>Aporta una solución de software lista para producción (Release Candidate RC1) que satisface estándares de desarrollo comercial: código modular, separación de responsabilidades en arquitectura cliente-servidor, seguridad RBAC mediante tokens JWT (OWASP, 2023), manejo de excepciones y una interfaz de usuario fluida desarrollada con Next.js 14 y Tailwind CSS.</w:t>
+        <w:t>Aporta una solución de software lista para producción (Release Candidate RC1) desplegada en la nube mediante Vercel que satisface estándares de desarrollo comercial: código modular, separación de responsabilidades en arquitectura cliente-servidor, seguridad RBAC mediante tokens JWT (OWASP, 2023), manejo de excepciones y una interfaz de usuario fluida desarrollada con Next.js 14 y Tailwind CSS.</w:t>
       </w:r>
     </w:p>
     <w:p>
@@ -639,7 +651,7 @@
     </w:p>
     <w:p>
       <w:r>
-        <w:t>1. Diseñar una arquitectura de software desacoplada compuesta por un frontend responsivo en Next.js 14 y un backend REST API en Flask 3.0 con soporte para persistencia relacional en PostgreSQL / SQLite.</w:t>
+        <w:t>1. Diseñar una arquitectura de software desacoplada compuesta por un frontend responsivo en Next.js 14 desplegado en Vercel y un backend REST API en Flask 3.0 con soporte para persistencia relacional en PostgreSQL / SQLite.</w:t>
       </w:r>
     </w:p>
     <w:p>
@@ -819,7 +831,7 @@
     </w:p>
     <w:p>
       <w:r>
-        <w:t>1. Capa de Presentación (Frontend): Desarrollada con Next.js 14 (App Router) en TypeScript, con renderizado en el cliente (CSR), manejo de estado global reactivo mediante Zustand (stores/taskStore.ts) y estilos dinámicos basados en Tailwind CSS.</w:t>
+        <w:t>1. Capa de Presentación (Frontend): Desarrollada con Next.js 14 (App Router) en TypeScript, desplegada en Vercel (https://progest-smart-analytics.vercel.app), con renderizado en el cliente (CSR), manejo de estado global reactivo mediante Zustand (stores/taskStore.ts) y estilos dinámicos basados en Tailwind CSS.</w:t>
       </w:r>
     </w:p>
     <w:p>
@@ -1683,7 +1695,7 @@
     </w:p>
     <w:p>
       <w:r>
-        <w:t>El frontend implementa la estructura de Next.js 14 App Router (React Documentation, 2024) combinada con Zustand para el manejo de estado global sin recargas de página y Tailwind CSS para la renderización de gradientes HSL adaptativos.</w:t>
+        <w:t>El frontend implementa la estructura de Next.js 14 App Router (React Documentation, 2024) desplegada en Vercel combinada con Zustand para el manejo de estado global sin recargas de página y Tailwind CSS para la renderización de gradientes HSL adaptativos.</w:t>
       </w:r>
     </w:p>
     <w:p>
@@ -1867,7 +1879,7 @@
                 <w:color w:val="334155"/>
                 <w:sz w:val="19"/>
               </w:rPr>
-              <w:t>Renderizado reactivo de la interfaz web.</w:t>
+              <w:t>Renderizado reactivo desplegado en Vercel.</w:t>
             </w:r>
           </w:p>
         </w:tc>
@@ -3026,7 +3038,7 @@
                 <w:color w:val="334155"/>
                 <w:sz w:val="19"/>
               </w:rPr>
-              <w:t>Carga responsive, botones CTA y selector de tema.</w:t>
+              <w:t>Carga responsive en Vercel.</w:t>
             </w:r>
           </w:p>
         </w:tc>
@@ -5344,7 +5356,7 @@
     </w:p>
     <w:p>
       <w:r>
-        <w:t>Se desarrolló una plataforma web comercial de alto rendimiento (Release Candidate RC1) caracterizada por una arquitectura cliente-servidor desacoplada (Next.js 14 y Flask 3.0), aprobación en las matrices de auditoría QA de 12 módulos y ausencia de errores de consola.</w:t>
+        <w:t>Se desarrolló una plataforma web comercial de alto rendimiento (Release Candidate RC1) caracterizada por una arquitectura cliente-servidor desacoplada (Next.js 14 y Flask 3.0), desplegada en Vercel (https://progest-smart-analytics.vercel.app), aprobación en las matrices de auditoría QA de 12 módulos y ausencia de errores de consola.</w:t>
       </w:r>
     </w:p>
     <w:p>

</xml_diff>